<commit_message>
fix(labs): no commands for learners; show the agent team's messages
- submit.mjs / approve.mjs: in a Claude studio (chat approval hook
  installed) point to "approved <id> by <name>" in the chat, never a
  terminal command; the Codex edition keeps its terminal approval.
- Studio charter (Claude): never ask the person to run a command, open a
  terminal or edit a file; if an approval was not recorded, ask them to
  paste the line again.
- Lab 10: the review artifact opens with a Team chat (who messaged whom,
  in order) instead of the terminal-only agent panel and Ctrl+T.
- Lab 15: the decision artifact shows the advocate/critic debate.
- Rebuilt decks, LP, LG, labs and Prompts pages for both editions.

Co-Authored-By: Claude Opus 5.5 <noreply@anthropic.com>
</commit_message>
<xml_diff>
--- a/courseware_claude/LG-Multi AI Agents Workflow for Content Creation - Claude-v3.5.docx
+++ b/courseware_claude/LG-Multi AI Agents Workflow for Content Creation - Claude-v3.5.docx
@@ -14912,7 +14912,7 @@
         <w:rPr>
           <w:b w:val="0"/>
         </w:rPr>
-        <w:t xml:space="preserve"> — Copy and paste Prompt A. Teammates appear in the panel; ↑ ↓ and Enter open one; Ctrl+T shows the task list.</w:t>
+        <w:t xml:space="preserve"> — Copy and paste Prompt A. The Lead starts two teammates and tells you as each one starts and finishes.</w:t>
       </w:r>
     </w:p>
     <w:p>
@@ -14929,7 +14929,7 @@
         <w:rPr>
           <w:b w:val="0"/>
         </w:rPr>
-        <w:t xml:space="preserve"> — The designer asks the creator for each post's hook; the Lead sends fixes back.</w:t>
+        <w:t xml:space="preserve"> — The review page opens with a Team chat: the designer asking the creator for each hook, and the Lead's fixes.</w:t>
       </w:r>
     </w:p>
     <w:p>
@@ -15048,7 +15048,7 @@
         <w:rPr>
           <w:sz w:val="21"/>
         </w:rPr>
-        <w:t>- You: fact-check and fin-compliance on every post and image; message fixes to the teammate who owns it. Before you start, ask me how I will review: in the artifact, or by email (then ask for the approver's address). When a post passes, submit it for review with scripts/submit.mjs. Publish the two posts as an artifact, each as it will look in the feed, with its image and alt text; under each post put two working buttons (JavaScript): Approve turns the card green; Request changes opens a box for my note. A bar at the bottom asks my name once, builds the exact lines to paste in the chat ("approved &lt;id&gt; by &lt;name&gt;", "changes &lt;id&gt;: &lt;note&gt;") and has a Copy button that says "Copied - now paste it in the chat". Keep the lines on screen in case copying is blocked. If I chose email, send ONE review email to the approver with Gmail: the artifact link and what passed the checks. Send nothing else; publish nothing. Write for a business owner, in plain English: no codes, IDs, file names or line numbers; start with what it means and what I do next. Save a Word copy (.docx) of each result.</w:t>
+        <w:t>- You: fact-check and fin-compliance on every post and image; message fixes to the teammate who owns it. Before you start, ask me how I will review: in the artifact, or by email (then ask for the approver's address). When a post passes, submit it for review with scripts/submit.mjs. Publish the two posts as an artifact. At the top, a Team chat: the messages the teammates and you sent each other, in order, each with who sent it. Then each post as it will look in the feed, with its image and alt text; under each post put two working buttons (JavaScript): Approve turns the card green; Request changes opens a box for my note. A bar at the bottom asks my name once, builds the exact lines to paste in the chat ("approved &lt;id&gt; by &lt;name&gt;", "changes &lt;id&gt;: &lt;note&gt;") and has a Copy button that says "Copied - now paste it in the chat". Keep the lines on screen in case copying is blocked. If I chose email, send ONE review email to the approver with Gmail: the artifact link and what passed the checks. Send nothing else; publish nothing. Write for a business owner, in plain English: no codes, IDs, file names or line numbers; start with what it means and what I do next. Save a Word copy (.docx) of each result.</w:t>
       </w:r>
     </w:p>
     <w:p>
@@ -15148,7 +15148,7 @@
         <w:rPr>
           <w:b w:val="0"/>
         </w:rPr>
-        <w:t>☐  Two teammates ran; the task list showed their tasks.</w:t>
+        <w:t>☐  Two teammates ran; the Lead said when each started and finished.</w:t>
       </w:r>
     </w:p>
     <w:p>
@@ -15159,7 +15159,7 @@
         <w:rPr>
           <w:b w:val="0"/>
         </w:rPr>
-        <w:t>☐  The designer and the creator messaged each other.</w:t>
+        <w:t>☐  The Team chat shows the designer and the creator messaging each other.</w:t>
       </w:r>
     </w:p>
     <w:p>
@@ -15217,7 +15217,7 @@
         <w:rPr>
           <w:b w:val="0"/>
         </w:rPr>
-        <w:t xml:space="preserve"> — Start a new session in your studio folder and ask for "an agent team" by name.</w:t>
+        <w:t xml:space="preserve"> — Check you are in the current horizon-studio folder from the course, start a new session and ask for "an agent team" by name.</w:t>
       </w:r>
     </w:p>
     <w:p>
@@ -18660,7 +18660,7 @@
         <w:rPr>
           <w:b w:val="0"/>
         </w:rPr>
-        <w:t xml:space="preserve"> — Copy and paste Prompt A. The advocate and the critic message each other; Ctrl+T shows the task list.</w:t>
+        <w:t xml:space="preserve"> — Copy and paste Prompt A. The advocate and the critic message each other; the decision page shows their debate.</w:t>
       </w:r>
     </w:p>
     <w:p>
@@ -18806,7 +18806,7 @@
         <w:rPr>
           <w:sz w:val="21"/>
         </w:rPr>
-        <w:t>- You: write strategy/turning-55-decision.md with the pros, the cons, your verdict (go / go with conditions / no-go) and the conditions. Publish the decision as an artifact with the verdict on top, the pros and cons in two columns, and what I do next. Then wait for my decision. Write for a business owner, in plain English: no codes, IDs, file names or line numbers; start with what it means and what I do next. Save a Word copy (.docx) of each result.</w:t>
+        <w:t>- You: write strategy/turning-55-decision.md with the pros, the cons, your verdict (go / go with conditions / no-go) and the conditions. Publish the decision as an artifact with the verdict on top, the pros and cons in two columns, the debate (the messages the advocate and critic sent each other, in order) and what I do next. Then wait for my decision. Write for a business owner, in plain English: no codes, IDs, file names or line numbers; start with what it means and what I do next. Save a Word copy (.docx) of each result.</w:t>
       </w:r>
     </w:p>
     <w:p>

</xml_diff>

<commit_message>
feat(labs): Claude puts the data on Google Drive (Labs 4 and 13)
Claude Edition: instead of a manual upload, learners ask Claude to create
the Horizon Studio folder and upload data/ (Lab 4) and to upload
campaign-results.csv (Lab 13) through the Google Drive connector, as plain
files (no conversion to Docs/Sheets). Verified end to end: folder created,
CSV uploaded unconverted and read back. Manual upload remains the fallback
under If it goes wrong. ChatGPT Edition unchanged.

Co-Authored-By: Claude Opus 5.5 <noreply@anthropic.com>
</commit_message>
<xml_diff>
--- a/courseware_claude/LG-Multi AI Agents Workflow for Content Creation - Claude-v3.5.docx
+++ b/courseware_claude/LG-Multi AI Agents Workflow for Content Creation - Claude-v3.5.docx
@@ -1776,7 +1776,7 @@
         </w:rPr>
         <w:t>Lab 7 — Growth Analyst and Strategist: Cadence and Calendar</w:t>
         <w:tab/>
-        <w:t>28</w:t>
+        <w:t>29</w:t>
       </w:r>
     </w:p>
     <w:p>
@@ -2370,7 +2370,7 @@
         </w:rPr>
         <w:t>Key ideas for Lab 14</w:t>
         <w:tab/>
-        <w:t>45</w:t>
+        <w:t>46</w:t>
       </w:r>
     </w:p>
     <w:p>
@@ -2388,7 +2388,7 @@
         </w:rPr>
         <w:t>Responsible AI in the Team</w:t>
         <w:tab/>
-        <w:t>45</w:t>
+        <w:t>46</w:t>
       </w:r>
     </w:p>
     <w:p>
@@ -2442,7 +2442,7 @@
         </w:rPr>
         <w:t>Key ideas for Lab 15</w:t>
         <w:tab/>
-        <w:t>47</w:t>
+        <w:t>48</w:t>
       </w:r>
     </w:p>
     <w:p>
@@ -2460,7 +2460,7 @@
         </w:rPr>
         <w:t>Subagents vs Agent Teams</w:t>
         <w:tab/>
-        <w:t>47</w:t>
+        <w:t>48</w:t>
       </w:r>
     </w:p>
     <w:p>
@@ -2532,7 +2532,7 @@
         </w:rPr>
         <w:t>Course Summary</w:t>
         <w:tab/>
-        <w:t>50</w:t>
+        <w:t>51</w:t>
       </w:r>
     </w:p>
     <w:p>
@@ -2550,7 +2550,7 @@
         </w:rPr>
         <w:t>How Each Pattern Is Triggered</w:t>
         <w:tab/>
-        <w:t>50</w:t>
+        <w:t>51</w:t>
       </w:r>
     </w:p>
     <w:p>
@@ -2622,7 +2622,7 @@
         </w:rPr>
         <w:t>Support</w:t>
         <w:tab/>
-        <w:t>52</w:t>
+        <w:t>53</w:t>
       </w:r>
     </w:p>
     <w:p>
@@ -2640,7 +2640,7 @@
         </w:rPr>
         <w:t>Assessment flow</w:t>
         <w:tab/>
-        <w:t>52</w:t>
+        <w:t>53</w:t>
       </w:r>
       <w:r>
         <w:fldChar w:fldCharType="end"/>
@@ -9300,7 +9300,7 @@
         <w:rPr>
           <w:b w:val="0"/>
         </w:rPr>
-        <w:t xml:space="preserve"> — Upload data/ to a Drive folder named Horizon Studio.</w:t>
+        <w:t xml:space="preserve"> — Ask: "Create a Google Drive folder named Horizon Studio and upload every file in data/ to it as plain files — do not convert them."</w:t>
       </w:r>
     </w:p>
     <w:p>
@@ -9516,6 +9516,23 @@
           <w:b w:val="0"/>
         </w:rPr>
         <w:t xml:space="preserve"> — Reconnect and grant read access to the Horizon Studio folder.</w:t>
+      </w:r>
+    </w:p>
+    <w:p>
+      <w:pPr>
+        <w:pStyle w:val="ListBullet"/>
+      </w:pPr>
+      <w:r>
+        <w:rPr>
+          <w:b/>
+        </w:rPr>
+        <w:t>Claude cannot upload to Drive</w:t>
+      </w:r>
+      <w:r>
+        <w:rPr>
+          <w:b w:val="0"/>
+        </w:rPr>
+        <w:t xml:space="preserve"> — Check Google Drive is in /mcp. Or upload the files yourself: drive.google.com → New → New folder "Horizon Studio", open it → New → File upload.</w:t>
       </w:r>
     </w:p>
     <w:p>
@@ -17258,7 +17275,7 @@
         <w:rPr>
           <w:b w:val="0"/>
         </w:rPr>
-        <w:t xml:space="preserve"> — Upload campaign-results.csv to the Horizon Studio folder.</w:t>
+        <w:t xml:space="preserve"> — Ask: "Upload data/campaign-results.csv to my Google Drive folder Horizon Studio as a plain file, replacing any old copy."</w:t>
       </w:r>
     </w:p>
     <w:p>
@@ -17520,6 +17537,23 @@
           <w:b w:val="0"/>
         </w:rPr>
         <w:t xml:space="preserve"> — Write "draft only — never send" in both the skill and the task instructions.</w:t>
+      </w:r>
+    </w:p>
+    <w:p>
+      <w:pPr>
+        <w:pStyle w:val="ListBullet"/>
+      </w:pPr>
+      <w:r>
+        <w:rPr>
+          <w:b/>
+        </w:rPr>
+        <w:t>Claude cannot upload to Drive</w:t>
+      </w:r>
+      <w:r>
+        <w:rPr>
+          <w:b w:val="0"/>
+        </w:rPr>
+        <w:t xml:space="preserve"> — Upload it yourself: drive.google.com → New → New folder "Horizon Studio" (if missing), open it → New → File upload.</w:t>
       </w:r>
     </w:p>
     <w:p>

</xml_diff>

<commit_message>
fix(labs): Lab 15 files reach older downloads; fixes get Copy cards
- Lab 10 "Get the latest kit" (Claude) also downloads Lab 15's
  turning-55-brief.md and turning-55-draft.md.
- Lab 15 If it goes wrong: "Claude cannot find turning-55-brief.md" with
  a one-line ask that downloads both from the course repo.
- Prompts page: asks quoted in If it goes wrong get "If needed" Copy cards.

Co-Authored-By: Claude Opus 5.5 <noreply@anthropic.com>
</commit_message>
<xml_diff>
--- a/courseware_claude/LG-Multi AI Agents Workflow for Content Creation - Claude-v3.5.docx
+++ b/courseware_claude/LG-Multi AI Agents Workflow for Content Creation - Claude-v3.5.docx
@@ -15064,7 +15064,7 @@
         <w:rPr>
           <w:sz w:val="21"/>
         </w:rPr>
-        <w:t>.claude/settings.json; scripts/approve-chat.mjs, gate-hook.mjs, lib.mjs, publish.mjs, serve-site.mjs and submit.mjs; data/publishing-spec.md, channel-formats.md, connect-accounts.md and env.example. Touch nothing else. Then add these rules to CLAUDE.md if they are missing: every post links to http://localhost:8080/ with UTM tags, never a claude.ai artifact link; a person approves by typing "approved &lt;id&gt; by &lt;name&gt;" in the chat; never ask me to run a command. Then start my website and tell me in one line that the kit is up to date.</w:t>
+        <w:t>.claude/settings.json; scripts/approve-chat.mjs, gate-hook.mjs, lib.mjs, publish.mjs, serve-site.mjs and submit.mjs; data/publishing-spec.md, channel-formats.md, connect-accounts.md, env.example, turning-55-brief.md and turning-55-draft.md. Touch nothing else. Then add these rules to CLAUDE.md if they are missing: every post links to http://localhost:8080/ with UTM tags, never a claude.ai artifact link; a person approves by typing "approved &lt;id&gt; by &lt;name&gt;" in the chat; never ask me to run a command. Then start my website and tell me in one line that the kit is up to date.</w:t>
       </w:r>
     </w:p>
     <w:p>
@@ -19256,6 +19256,23 @@
           <w:b/>
         </w:rPr>
         <w:t>If it goes wrong</w:t>
+      </w:r>
+    </w:p>
+    <w:p>
+      <w:pPr>
+        <w:pStyle w:val="ListBullet"/>
+      </w:pPr>
+      <w:r>
+        <w:rPr>
+          <w:b/>
+        </w:rPr>
+        <w:t>Claude cannot find turning-55-brief.md</w:t>
+      </w:r>
+      <w:r>
+        <w:rPr>
+          <w:b w:val="0"/>
+        </w:rPr>
+        <w:t xml:space="preserve"> — Your folder is an older download. Ask: "Download turning-55-brief.md and turning-55-draft.md from https://raw.githubusercontent.com/tertiarycourses/TGS-2023036153-Multi-AI-Agents-Workflow-for-Content-Creation/main/labs_claude/horizon-studio/data/ into data/." Then paste Prompt A again.</w:t>
       </w:r>
     </w:p>
     <w:p>

</xml_diff>